<commit_message>
feat : week 1
</commit_message>
<xml_diff>
--- a/MobileDevelopment/Week 1 /W1 - PRACTICE - Dart Basics PART 1 - Explore.docx
+++ b/MobileDevelopment/Week 1 /W1 - PRACTICE - Dart Basics PART 1 - Explore.docx
@@ -6,11 +6,10 @@
       <w:pPr>
         <w:pStyle w:val="Normal"/>
         <w:widowControl w:val="false"/>
-        <w:pBdr/>
         <w:rPr/>
       </w:pPr>
-      <w:bookmarkStart w:id="0" w:name="_Hlk173841123"/>
-      <w:bookmarkStart w:id="1" w:name="_heading=h.gjdgxs"/>
+      <w:bookmarkStart w:id="0" w:name="_heading=h.gjdgxs"/>
+      <w:bookmarkStart w:id="1" w:name="_Hlk173841123"/>
       <w:bookmarkEnd w:id="0"/>
       <w:bookmarkEnd w:id="1"/>
       <w:r>
@@ -79,8 +78,8 @@
       <w:r>
         <w:rPr/>
       </w:r>
-      <w:bookmarkStart w:id="4" w:name="_Hlk172759242"/>
-      <w:bookmarkStart w:id="5" w:name="_Hlk172759242"/>
+      <w:bookmarkStart w:id="4" w:name="_Hlk172759242_Copy_1"/>
+      <w:bookmarkStart w:id="5" w:name="_Hlk172759242_Copy_1"/>
       <w:bookmarkEnd w:id="5"/>
     </w:p>
     <w:p>
@@ -92,338 +91,13 @@
           <w:i/>
         </w:rPr>
       </w:pPr>
-      <w:r>
-        <w:rPr/>
-        <mc:AlternateContent>
-          <mc:Choice Requires="wps">
-            <w:drawing>
-              <wp:inline distT="0" distB="0" distL="0" distR="0">
-                <wp:extent cx="190500" cy="190500"/>
-                <wp:effectExtent l="0" t="0" r="0" b="0"/>
-                <wp:docPr id="1" name="image3.png"/>
-                <a:graphic xmlns:a="http://schemas.openxmlformats.org/drawingml/2006/main">
-                  <a:graphicData uri="http://schemas.openxmlformats.org/drawingml/2006/picture">
-                    <pic:pic xmlns:pic="http://schemas.openxmlformats.org/drawingml/2006/picture">
-                      <pic:nvPicPr>
-                        <pic:cNvPr id="2" name="image3.png" descr=""/>
-                        <pic:cNvPicPr/>
-                      </pic:nvPicPr>
-                      <pic:blipFill>
-                        <a:blip r:embed="rId2"/>
-                        <a:stretch/>
-                      </pic:blipFill>
-                      <pic:spPr>
-                        <a:xfrm>
-                          <a:off x="0" y="0"/>
-                          <a:ext cx="190440" cy="190440"/>
-                        </a:xfrm>
-                        <a:prstGeom prst="rect">
-                          <a:avLst/>
-                        </a:prstGeom>
-                        <a:noFill/>
-                        <a:ln w="0">
-                          <a:noFill/>
-                        </a:ln>
-                      </pic:spPr>
-                    </pic:pic>
-                  </a:graphicData>
-                </a:graphic>
-              </wp:inline>
-            </w:drawing>
-          </mc:Choice>
-          <mc:Fallback>
-            <w:pict>
-              <v:shapetype id="_x0000_t75" coordsize="21600,21600" o:spt="75" o:preferrelative="t" path="m@4@5l@4@11@9@11@9@5xe" filled="f" stroked="f">
-                <v:stroke joinstyle="miter"/>
-                <v:formulas>
-                  <v:f eqn="if lineDrawn pixelLineWidth 0"/>
-                  <v:f eqn="sum @0 1 0"/>
-                  <v:f eqn="sum 0 0 @1"/>
-                  <v:f eqn="prod @2 1 2"/>
-                  <v:f eqn="prod @3 21600 pixelWidth"/>
-                  <v:f eqn="prod @3 21600 pixelHeight"/>
-                  <v:f eqn="sum @0 0 1"/>
-                  <v:f eqn="prod @6 1 2"/>
-                  <v:f eqn="prod @7 21600 pixelWidth"/>
-                  <v:f eqn="sum @8 21600 0"/>
-                  <v:f eqn="prod @7 21600 pixelHeight"/>
-                  <v:f eqn="sum @10 21600 0"/>
-                </v:formulas>
-                <v:path o:extrusionok="f" gradientshapeok="t" o:connecttype="rect"/>
-                <o:lock v:ext="edit" aspectratio="t"/>
-              </v:shapetype>
-              <v:shape id="shape_0" ID="image3.png" stroked="f" o:allowincell="f" style="position:absolute;margin-left:0pt;margin-top:-15.05pt;width:14.95pt;height:14.95pt;mso-wrap-style:none;v-text-anchor:middle;mso-position-vertical:top" type="_x0000_t75">
-                <v:imagedata r:id="rId3" o:detectmouseclick="t"/>
-                <v:stroke color="#3465a4" joinstyle="round" endcap="flat"/>
-                <w10:wrap type="none"/>
-              </v:shape>
-            </w:pict>
-          </mc:Fallback>
-        </mc:AlternateContent>
-      </w:r>
-      <w:r>
-        <w:rPr/>
-        <w:t xml:space="preserve"> </w:t>
-      </w:r>
-      <w:r>
-        <w:rPr>
-          <w:rFonts w:eastAsia="Calibri" w:cs="Calibri" w:ascii="Calibri" w:hAnsi="Calibri"/>
-          <w:i/>
-        </w:rPr>
-        <w:t xml:space="preserve">What do you need to </w:t>
-      </w:r>
-      <w:r>
-        <w:rPr>
-          <w:rFonts w:eastAsia="Calibri" w:cs="Calibri" w:ascii="Calibri" w:hAnsi="Calibri"/>
-          <w:b/>
-          <w:bCs/>
-          <w:i/>
-        </w:rPr>
-        <w:t>be able to do</w:t>
-      </w:r>
-      <w:r>
-        <w:rPr>
-          <w:rFonts w:eastAsia="Calibri" w:cs="Calibri" w:ascii="Calibri" w:hAnsi="Calibri"/>
-          <w:i/>
-        </w:rPr>
-        <w:t xml:space="preserve"> for next week?</w:t>
-      </w:r>
-    </w:p>
-    <w:p>
-      <w:pPr>
-        <w:pStyle w:val="NoSpacing"/>
-        <w:numPr>
-          <w:ilvl w:val="0"/>
-          <w:numId w:val="2"/>
-        </w:numPr>
-        <w:rPr/>
-      </w:pPr>
-      <w:r>
-        <w:rPr/>
-        <w:t xml:space="preserve">Identify the </w:t>
-      </w:r>
-      <w:r>
-        <w:rPr>
-          <w:b/>
-          <w:bCs/>
-        </w:rPr>
-        <w:t>type</w:t>
-      </w:r>
-      <w:r>
-        <w:rPr/>
-        <w:t xml:space="preserve"> of variable</w:t>
-      </w:r>
-    </w:p>
-    <w:p>
-      <w:pPr>
-        <w:pStyle w:val="NoSpacing"/>
-        <w:numPr>
-          <w:ilvl w:val="0"/>
-          <w:numId w:val="2"/>
-        </w:numPr>
-        <w:rPr/>
-      </w:pPr>
-      <w:r>
-        <w:rPr/>
-        <w:t xml:space="preserve">Manipulate  </w:t>
-      </w:r>
-      <w:r>
-        <w:rPr>
-          <w:b/>
-          <w:bCs/>
-        </w:rPr>
-        <w:t>nullable</w:t>
-      </w:r>
-      <w:r>
-        <w:rPr/>
-        <w:t xml:space="preserve"> and </w:t>
-      </w:r>
-      <w:r>
-        <w:rPr>
-          <w:b/>
-          <w:bCs/>
-        </w:rPr>
-        <w:t>non-nullable</w:t>
-      </w:r>
-      <w:r>
-        <w:rPr/>
-        <w:t xml:space="preserve"> variables.</w:t>
-      </w:r>
-    </w:p>
-    <w:p>
-      <w:pPr>
-        <w:pStyle w:val="NoSpacing"/>
-        <w:numPr>
-          <w:ilvl w:val="0"/>
-          <w:numId w:val="2"/>
-        </w:numPr>
-        <w:rPr/>
-      </w:pPr>
-      <w:r>
-        <w:rPr/>
-        <w:t xml:space="preserve">Differentiate between </w:t>
-      </w:r>
-      <w:r>
-        <w:rPr>
-          <w:b/>
-          <w:bCs/>
-        </w:rPr>
-        <w:t>final</w:t>
-      </w:r>
-      <w:r>
-        <w:rPr/>
-        <w:t xml:space="preserve"> and </w:t>
-      </w:r>
-      <w:r>
-        <w:rPr>
-          <w:b/>
-          <w:bCs/>
-        </w:rPr>
-        <w:t>const</w:t>
-      </w:r>
-      <w:r>
-        <w:rPr/>
-        <w:t>.</w:t>
-      </w:r>
-    </w:p>
-    <w:p>
-      <w:pPr>
-        <w:pStyle w:val="NoSpacing"/>
-        <w:numPr>
-          <w:ilvl w:val="0"/>
-          <w:numId w:val="2"/>
-        </w:numPr>
-        <w:rPr>
-          <w:b/>
-          <w:bCs/>
-        </w:rPr>
-      </w:pPr>
-      <w:r>
-        <w:rPr/>
-        <w:t xml:space="preserve">Manipulate </w:t>
-      </w:r>
-      <w:r>
-        <w:rPr>
-          <w:b/>
-          <w:bCs/>
-        </w:rPr>
-        <w:t>strings, lists, and maps.</w:t>
-      </w:r>
-    </w:p>
-    <w:p>
-      <w:pPr>
-        <w:pStyle w:val="NoSpacing"/>
-        <w:numPr>
-          <w:ilvl w:val="0"/>
-          <w:numId w:val="2"/>
-        </w:numPr>
-        <w:rPr/>
-      </w:pPr>
-      <w:r>
-        <w:rPr/>
-        <w:t xml:space="preserve">Use </w:t>
-      </w:r>
-      <w:r>
-        <w:rPr>
-          <w:b/>
-          <w:bCs/>
-        </w:rPr>
-        <w:t>loops</w:t>
-      </w:r>
-      <w:r>
-        <w:rPr/>
-        <w:t xml:space="preserve"> and </w:t>
-      </w:r>
-      <w:r>
-        <w:rPr>
-          <w:b/>
-          <w:bCs/>
-        </w:rPr>
-        <w:t>conditions</w:t>
-      </w:r>
-      <w:r>
-        <w:rPr/>
-        <w:t xml:space="preserve"> to control flow.</w:t>
-      </w:r>
-    </w:p>
-    <w:p>
-      <w:pPr>
-        <w:pStyle w:val="NoSpacing"/>
-        <w:numPr>
-          <w:ilvl w:val="0"/>
-          <w:numId w:val="2"/>
-        </w:numPr>
-        <w:rPr/>
-      </w:pPr>
-      <w:r>
-        <w:rPr/>
-        <w:t xml:space="preserve">Define and call functions with positional and </w:t>
-      </w:r>
-      <w:r>
-        <w:rPr>
-          <w:b/>
-          <w:bCs/>
-        </w:rPr>
-        <w:t>named arguments</w:t>
-      </w:r>
-      <w:r>
-        <w:rPr/>
-        <w:t xml:space="preserve">, understand </w:t>
-      </w:r>
-      <w:r>
-        <w:rPr>
-          <w:b/>
-          <w:bCs/>
-        </w:rPr>
-        <w:t>arrow syntax</w:t>
-      </w:r>
-    </w:p>
-    <w:p>
-      <w:pPr>
-        <w:pStyle w:val="NoSpacing"/>
-        <w:ind w:left="720"/>
-        <w:rPr/>
-      </w:pPr>
-      <w:r>
-        <w:rPr/>
-      </w:r>
-    </w:p>
-    <w:p>
-      <w:pPr>
-        <w:pStyle w:val="NoSpacing"/>
-        <w:rPr/>
-      </w:pPr>
-      <w:r>
-        <w:rPr/>
-      </w:r>
-    </w:p>
-    <w:p>
-      <w:pPr>
-        <w:pStyle w:val="NoSpacing"/>
-        <w:jc w:val="center"/>
-        <w:rPr>
-          <w:i/>
-          <w:i/>
-          <w:iCs/>
-          <w:color w:val="FF0000"/>
-          <w:sz w:val="32"/>
-          <w:szCs w:val="32"/>
-        </w:rPr>
-      </w:pPr>
-      <w:r>
-        <w:rPr>
-          <w:sz w:val="48"/>
-          <w:szCs w:val="48"/>
-        </w:rPr>
-        <w:t xml:space="preserve"> </w:t>
-      </w:r>
       <w:r>
         <w:rPr/>
         <w:drawing>
           <wp:inline distT="0" distB="0" distL="0" distR="0">
-            <wp:extent cx="4914900" cy="789940"/>
+            <wp:extent cx="190500" cy="190500"/>
             <wp:effectExtent l="0" t="0" r="0" b="0"/>
-            <wp:docPr id="3" name="Picture 1" descr=""/>
+            <wp:docPr id="1" name="image3.png" descr=""/>
             <wp:cNvGraphicFramePr>
               <a:graphicFrameLocks xmlns:a="http://schemas.openxmlformats.org/drawingml/2006/main" noChangeAspect="1"/>
             </wp:cNvGraphicFramePr>
@@ -431,13 +105,310 @@
               <a:graphicData uri="http://schemas.openxmlformats.org/drawingml/2006/picture">
                 <pic:pic xmlns:pic="http://schemas.openxmlformats.org/drawingml/2006/picture">
                   <pic:nvPicPr>
-                    <pic:cNvPr id="3" name="Picture 1" descr=""/>
+                    <pic:cNvPr id="1" name="image3.png" descr=""/>
                     <pic:cNvPicPr>
                       <a:picLocks noChangeAspect="1" noChangeArrowheads="1"/>
                     </pic:cNvPicPr>
                   </pic:nvPicPr>
                   <pic:blipFill>
-                    <a:blip r:embed="rId4"/>
+                    <a:blip r:embed="rId2"/>
+                    <a:stretch>
+                      <a:fillRect/>
+                    </a:stretch>
+                  </pic:blipFill>
+                  <pic:spPr bwMode="auto">
+                    <a:xfrm>
+                      <a:off x="0" y="0"/>
+                      <a:ext cx="190500" cy="190500"/>
+                    </a:xfrm>
+                    <a:prstGeom prst="rect">
+                      <a:avLst/>
+                    </a:prstGeom>
+                    <a:noFill/>
+                  </pic:spPr>
+                </pic:pic>
+              </a:graphicData>
+            </a:graphic>
+          </wp:inline>
+        </w:drawing>
+      </w:r>
+      <w:r>
+        <w:rPr/>
+        <w:t xml:space="preserve"> </w:t>
+      </w:r>
+      <w:r>
+        <w:rPr>
+          <w:rFonts w:eastAsia="Calibri" w:cs="Calibri" w:ascii="Calibri" w:hAnsi="Calibri"/>
+          <w:i/>
+        </w:rPr>
+        <w:t xml:space="preserve">What do you need to </w:t>
+      </w:r>
+      <w:r>
+        <w:rPr>
+          <w:rFonts w:eastAsia="Calibri" w:cs="Calibri" w:ascii="Calibri" w:hAnsi="Calibri"/>
+          <w:b/>
+          <w:bCs/>
+          <w:i/>
+        </w:rPr>
+        <w:t>be able to do</w:t>
+      </w:r>
+      <w:r>
+        <w:rPr>
+          <w:rFonts w:eastAsia="Calibri" w:cs="Calibri" w:ascii="Calibri" w:hAnsi="Calibri"/>
+          <w:i/>
+        </w:rPr>
+        <w:t xml:space="preserve"> for next week?</w:t>
+      </w:r>
+    </w:p>
+    <w:p>
+      <w:pPr>
+        <w:pStyle w:val="NoSpacing"/>
+        <w:numPr>
+          <w:ilvl w:val="0"/>
+          <w:numId w:val="2"/>
+        </w:numPr>
+        <w:rPr/>
+      </w:pPr>
+      <w:r>
+        <w:rPr/>
+        <w:t xml:space="preserve">Identify the </w:t>
+      </w:r>
+      <w:r>
+        <w:rPr>
+          <w:b/>
+          <w:bCs/>
+        </w:rPr>
+        <w:t>type</w:t>
+      </w:r>
+      <w:r>
+        <w:rPr/>
+        <w:t xml:space="preserve"> of variable</w:t>
+      </w:r>
+    </w:p>
+    <w:p>
+      <w:pPr>
+        <w:pStyle w:val="NoSpacing"/>
+        <w:numPr>
+          <w:ilvl w:val="0"/>
+          <w:numId w:val="2"/>
+        </w:numPr>
+        <w:rPr/>
+      </w:pPr>
+      <w:r>
+        <w:rPr/>
+        <w:t xml:space="preserve">Manipulate  </w:t>
+      </w:r>
+      <w:r>
+        <w:rPr>
+          <w:b/>
+          <w:bCs/>
+        </w:rPr>
+        <w:t>nullable</w:t>
+      </w:r>
+      <w:r>
+        <w:rPr/>
+        <w:t xml:space="preserve"> and </w:t>
+      </w:r>
+      <w:r>
+        <w:rPr>
+          <w:b/>
+          <w:bCs/>
+        </w:rPr>
+        <w:t>non-nullable</w:t>
+      </w:r>
+      <w:r>
+        <w:rPr/>
+        <w:t xml:space="preserve"> variables.</w:t>
+      </w:r>
+    </w:p>
+    <w:p>
+      <w:pPr>
+        <w:pStyle w:val="NoSpacing"/>
+        <w:numPr>
+          <w:ilvl w:val="0"/>
+          <w:numId w:val="2"/>
+        </w:numPr>
+        <w:rPr/>
+      </w:pPr>
+      <w:r>
+        <w:rPr/>
+        <w:t xml:space="preserve">Differentiate between </w:t>
+      </w:r>
+      <w:r>
+        <w:rPr>
+          <w:b/>
+          <w:bCs/>
+        </w:rPr>
+        <w:t>final</w:t>
+      </w:r>
+      <w:r>
+        <w:rPr/>
+        <w:t xml:space="preserve"> and </w:t>
+      </w:r>
+      <w:r>
+        <w:rPr>
+          <w:b/>
+          <w:bCs/>
+        </w:rPr>
+        <w:t>const</w:t>
+      </w:r>
+      <w:r>
+        <w:rPr/>
+        <w:t>.</w:t>
+      </w:r>
+    </w:p>
+    <w:p>
+      <w:pPr>
+        <w:pStyle w:val="NoSpacing"/>
+        <w:numPr>
+          <w:ilvl w:val="0"/>
+          <w:numId w:val="2"/>
+        </w:numPr>
+        <w:rPr>
+          <w:b/>
+          <w:bCs/>
+        </w:rPr>
+      </w:pPr>
+      <w:r>
+        <w:rPr/>
+        <w:t xml:space="preserve">Manipulate </w:t>
+      </w:r>
+      <w:r>
+        <w:rPr>
+          <w:b/>
+          <w:bCs/>
+        </w:rPr>
+        <w:t>strings, lists, and maps.</w:t>
+      </w:r>
+    </w:p>
+    <w:p>
+      <w:pPr>
+        <w:pStyle w:val="NoSpacing"/>
+        <w:numPr>
+          <w:ilvl w:val="0"/>
+          <w:numId w:val="2"/>
+        </w:numPr>
+        <w:rPr/>
+      </w:pPr>
+      <w:r>
+        <w:rPr/>
+        <w:t xml:space="preserve">Use </w:t>
+      </w:r>
+      <w:r>
+        <w:rPr>
+          <w:b/>
+          <w:bCs/>
+        </w:rPr>
+        <w:t>loops</w:t>
+      </w:r>
+      <w:r>
+        <w:rPr/>
+        <w:t xml:space="preserve"> and </w:t>
+      </w:r>
+      <w:r>
+        <w:rPr>
+          <w:b/>
+          <w:bCs/>
+        </w:rPr>
+        <w:t>conditions</w:t>
+      </w:r>
+      <w:r>
+        <w:rPr/>
+        <w:t xml:space="preserve"> to control flow.</w:t>
+      </w:r>
+    </w:p>
+    <w:p>
+      <w:pPr>
+        <w:pStyle w:val="NoSpacing"/>
+        <w:numPr>
+          <w:ilvl w:val="0"/>
+          <w:numId w:val="2"/>
+        </w:numPr>
+        <w:rPr/>
+      </w:pPr>
+      <w:r>
+        <w:rPr/>
+        <w:t xml:space="preserve">Define and call functions with positional and </w:t>
+      </w:r>
+      <w:r>
+        <w:rPr>
+          <w:b/>
+          <w:bCs/>
+        </w:rPr>
+        <w:t>named arguments</w:t>
+      </w:r>
+      <w:r>
+        <w:rPr/>
+        <w:t xml:space="preserve">, understand </w:t>
+      </w:r>
+      <w:r>
+        <w:rPr>
+          <w:b/>
+          <w:bCs/>
+        </w:rPr>
+        <w:t>arrow syntax</w:t>
+      </w:r>
+    </w:p>
+    <w:p>
+      <w:pPr>
+        <w:pStyle w:val="NoSpacing"/>
+        <w:ind w:left="720"/>
+        <w:rPr/>
+      </w:pPr>
+      <w:r>
+        <w:rPr/>
+      </w:r>
+    </w:p>
+    <w:p>
+      <w:pPr>
+        <w:pStyle w:val="NoSpacing"/>
+        <w:rPr/>
+      </w:pPr>
+      <w:r>
+        <w:rPr/>
+      </w:r>
+    </w:p>
+    <w:p>
+      <w:pPr>
+        <w:pStyle w:val="NoSpacing"/>
+        <w:jc w:val="center"/>
+        <w:rPr>
+          <w:i/>
+          <w:i/>
+          <w:iCs/>
+          <w:color w:val="FF0000"/>
+          <w:sz w:val="32"/>
+          <w:szCs w:val="32"/>
+        </w:rPr>
+      </w:pPr>
+      <w:r>
+        <w:rPr>
+          <w:sz w:val="48"/>
+          <w:szCs w:val="48"/>
+        </w:rPr>
+        <w:t xml:space="preserve"> </w:t>
+      </w:r>
+      <w:r>
+        <w:rPr/>
+        <w:drawing>
+          <wp:inline distT="0" distB="0" distL="0" distR="0">
+            <wp:extent cx="4914900" cy="789940"/>
+            <wp:effectExtent l="0" t="0" r="0" b="0"/>
+            <wp:docPr id="2" name="Picture 1" descr=""/>
+            <wp:cNvGraphicFramePr>
+              <a:graphicFrameLocks xmlns:a="http://schemas.openxmlformats.org/drawingml/2006/main" noChangeAspect="1"/>
+            </wp:cNvGraphicFramePr>
+            <a:graphic xmlns:a="http://schemas.openxmlformats.org/drawingml/2006/main">
+              <a:graphicData uri="http://schemas.openxmlformats.org/drawingml/2006/picture">
+                <pic:pic xmlns:pic="http://schemas.openxmlformats.org/drawingml/2006/picture">
+                  <pic:nvPicPr>
+                    <pic:cNvPr id="2" name="Picture 1" descr=""/>
+                    <pic:cNvPicPr>
+                      <a:picLocks noChangeAspect="1" noChangeArrowheads="1"/>
+                    </pic:cNvPicPr>
+                  </pic:nvPicPr>
+                  <pic:blipFill>
+                    <a:blip r:embed="rId3"/>
                     <a:stretch>
                       <a:fillRect/>
                     </a:stretch>
@@ -496,7 +467,7 @@
           <wp:inline distT="0" distB="0" distL="0" distR="0">
             <wp:extent cx="193675" cy="193675"/>
             <wp:effectExtent l="0" t="0" r="0" b="0"/>
-            <wp:docPr id="4" name="image5.png" descr=""/>
+            <wp:docPr id="3" name="image5.png" descr=""/>
             <wp:cNvGraphicFramePr>
               <a:graphicFrameLocks xmlns:a="http://schemas.openxmlformats.org/drawingml/2006/main" noChangeAspect="1"/>
             </wp:cNvGraphicFramePr>
@@ -504,13 +475,13 @@
               <a:graphicData uri="http://schemas.openxmlformats.org/drawingml/2006/picture">
                 <pic:pic xmlns:pic="http://schemas.openxmlformats.org/drawingml/2006/picture">
                   <pic:nvPicPr>
-                    <pic:cNvPr id="4" name="image5.png" descr=""/>
+                    <pic:cNvPr id="3" name="image5.png" descr=""/>
                     <pic:cNvPicPr>
                       <a:picLocks noChangeAspect="1" noChangeArrowheads="1"/>
                     </pic:cNvPicPr>
                   </pic:nvPicPr>
                   <pic:blipFill>
-                    <a:blip r:embed="rId5"/>
+                    <a:blip r:embed="rId4"/>
                     <a:stretch>
                       <a:fillRect/>
                     </a:stretch>
@@ -571,7 +542,7 @@
           <w:lang w:val="en-US"/>
         </w:rPr>
       </w:pPr>
-      <w:hyperlink r:id="rId6">
+      <w:hyperlink r:id="rId5">
         <w:r>
           <w:rPr>
             <w:rStyle w:val="Hyperlink"/>
@@ -594,7 +565,7 @@
           <w:lang w:val="en-US"/>
         </w:rPr>
       </w:pPr>
-      <w:hyperlink r:id="rId7">
+      <w:hyperlink r:id="rId6">
         <w:r>
           <w:rPr>
             <w:rStyle w:val="Hyperlink"/>
@@ -633,7 +604,7 @@
           <wp:inline distT="0" distB="0" distL="0" distR="0">
             <wp:extent cx="193675" cy="193675"/>
             <wp:effectExtent l="0" t="0" r="0" b="0"/>
-            <wp:docPr id="5" name="Image2" descr=""/>
+            <wp:docPr id="4" name="Image2" descr=""/>
             <wp:cNvGraphicFramePr>
               <a:graphicFrameLocks xmlns:a="http://schemas.openxmlformats.org/drawingml/2006/main" noChangeAspect="1"/>
             </wp:cNvGraphicFramePr>
@@ -641,13 +612,13 @@
               <a:graphicData uri="http://schemas.openxmlformats.org/drawingml/2006/picture">
                 <pic:pic xmlns:pic="http://schemas.openxmlformats.org/drawingml/2006/picture">
                   <pic:nvPicPr>
-                    <pic:cNvPr id="5" name="Image2" descr=""/>
+                    <pic:cNvPr id="4" name="Image2" descr=""/>
                     <pic:cNvPicPr>
                       <a:picLocks noChangeAspect="1" noChangeArrowheads="1"/>
                     </pic:cNvPicPr>
                   </pic:nvPicPr>
                   <pic:blipFill>
-                    <a:blip r:embed="rId8"/>
+                    <a:blip r:embed="rId7"/>
                     <a:stretch>
                       <a:fillRect/>
                     </a:stretch>
@@ -700,12 +671,12 @@
     <w:p>
       <w:pPr>
         <w:sectPr>
-          <w:headerReference w:type="even" r:id="rId9"/>
-          <w:headerReference w:type="default" r:id="rId10"/>
-          <w:headerReference w:type="first" r:id="rId11"/>
-          <w:footerReference w:type="even" r:id="rId12"/>
-          <w:footerReference w:type="default" r:id="rId13"/>
-          <w:footerReference w:type="first" r:id="rId14"/>
+          <w:headerReference w:type="even" r:id="rId8"/>
+          <w:headerReference w:type="default" r:id="rId9"/>
+          <w:headerReference w:type="first" r:id="rId10"/>
+          <w:footerReference w:type="even" r:id="rId11"/>
+          <w:footerReference w:type="default" r:id="rId12"/>
+          <w:footerReference w:type="first" r:id="rId13"/>
           <w:type w:val="nextPage"/>
           <w:pgSz w:w="12240" w:h="15840"/>
           <w:pgMar w:left="1440" w:right="1440" w:gutter="0" w:header="426" w:top="824" w:footer="720" w:bottom="777"/>
@@ -730,7 +701,7 @@
           <w:color w:val="1F2328"/>
         </w:rPr>
       </w:pPr>
-      <w:hyperlink r:id="rId15">
+      <w:hyperlink r:id="rId14">
         <w:r>
           <w:rPr>
             <w:rStyle w:val="Hyperlink"/>
@@ -754,7 +725,7 @@
           <w:color w:val="1F2328"/>
         </w:rPr>
       </w:pPr>
-      <w:hyperlink r:id="rId16">
+      <w:hyperlink r:id="rId15">
         <w:r>
           <w:rPr>
             <w:rStyle w:val="Hyperlink"/>
@@ -778,7 +749,7 @@
           <w:color w:val="1F2328"/>
         </w:rPr>
       </w:pPr>
-      <w:hyperlink r:id="rId17">
+      <w:hyperlink r:id="rId16">
         <w:r>
           <w:rPr>
             <w:rStyle w:val="Hyperlink"/>
@@ -802,7 +773,7 @@
           <w:color w:val="1F2328"/>
         </w:rPr>
       </w:pPr>
-      <w:hyperlink r:id="rId18">
+      <w:hyperlink r:id="rId17">
         <w:r>
           <w:rPr>
             <w:rStyle w:val="Hyperlink"/>
@@ -826,7 +797,7 @@
           <w:color w:val="1F2328"/>
         </w:rPr>
       </w:pPr>
-      <w:hyperlink r:id="rId19">
+      <w:hyperlink r:id="rId18">
         <w:r>
           <w:rPr>
             <w:rStyle w:val="Hyperlink"/>
@@ -850,7 +821,7 @@
           <w:color w:val="1F2328"/>
         </w:rPr>
       </w:pPr>
-      <w:hyperlink r:id="rId20">
+      <w:hyperlink r:id="rId19">
         <w:r>
           <w:rPr>
             <w:rStyle w:val="Hyperlink"/>
@@ -881,7 +852,7 @@
         <w:rPr>
           <w:rStyle w:val="Hyperlink"/>
           <w:rFonts w:cs="Segoe UI" w:ascii="Segoe UI" w:hAnsi="Segoe UI"/>
-          <w:color w:val="0969DA"/>
+          <w:color w:themeColor="hyperlink" w:val="0969DA"/>
         </w:rPr>
         <w:instrText xml:space="preserve"> HYPERLINK "https://dart.dev/guides/language/language-tour" \l "functions"</w:instrText>
       </w:r>
@@ -889,7 +860,7 @@
         <w:rPr>
           <w:rStyle w:val="Hyperlink"/>
           <w:rFonts w:cs="Segoe UI" w:ascii="Segoe UI" w:hAnsi="Segoe UI"/>
-          <w:color w:val="0969DA"/>
+          <w:color w:themeColor="hyperlink" w:val="0969DA"/>
         </w:rPr>
         <w:fldChar w:fldCharType="separate"/>
       </w:r>
@@ -897,7 +868,7 @@
         <w:rPr>
           <w:rStyle w:val="Hyperlink"/>
           <w:rFonts w:cs="Segoe UI" w:ascii="Segoe UI" w:hAnsi="Segoe UI"/>
-          <w:color w:val="0969DA"/>
+          <w:color w:themeColor="hyperlink" w:val="0969DA"/>
         </w:rPr>
         <w:t>Functions</w:t>
       </w:r>
@@ -905,7 +876,7 @@
         <w:rPr>
           <w:rStyle w:val="Hyperlink"/>
           <w:rFonts w:cs="Segoe UI" w:ascii="Segoe UI" w:hAnsi="Segoe UI"/>
-          <w:color w:val="0969DA"/>
+          <w:color w:themeColor="hyperlink" w:val="0969DA"/>
         </w:rPr>
         <w:fldChar w:fldCharType="end"/>
       </w:r>
@@ -950,8 +921,15 @@
           <w:textDirection w:val="lrTb"/>
           <w:docGrid w:type="default" w:linePitch="100" w:charSpace="4096"/>
         </w:sectPr>
-        <w:pStyle w:val="Normal"/>
-        <w:jc w:val="center"/>
+      </w:pPr>
+      <w:r>
+        <w:br w:type="page"/>
+      </w:r>
+    </w:p>
+    <w:p>
+      <w:pPr>
+        <w:pStyle w:val="Normal"/>
+        <w:spacing w:before="0" w:after="0"/>
         <w:rPr>
           <w:rFonts w:ascii="Calibri" w:hAnsi="Calibri" w:eastAsia="Calibri" w:cs="Calibri"/>
           <w:i/>
@@ -959,6 +937,7 @@
           <w:color w:val="00B0F0"/>
           <w:sz w:val="48"/>
           <w:szCs w:val="48"/>
+          <w:lang w:val="en-US"/>
         </w:rPr>
       </w:pPr>
       <w:r>
@@ -968,33 +947,6 @@
           <w:color w:val="00B0F0"/>
           <w:sz w:val="48"/>
           <w:szCs w:val="48"/>
-        </w:rPr>
-      </w:r>
-      <w:r>
-        <w:br w:type="page"/>
-      </w:r>
-    </w:p>
-    <w:p>
-      <w:pPr>
-        <w:pStyle w:val="Normal"/>
-        <w:spacing w:before="0" w:after="0"/>
-        <w:rPr>
-          <w:rFonts w:ascii="Calibri" w:hAnsi="Calibri" w:eastAsia="Calibri" w:cs="Calibri"/>
-          <w:i/>
-          <w:i/>
-          <w:color w:val="00B0F0"/>
-          <w:sz w:val="48"/>
-          <w:szCs w:val="48"/>
-          <w:lang w:val="en-US"/>
-        </w:rPr>
-      </w:pPr>
-      <w:r>
-        <w:rPr>
-          <w:rFonts w:eastAsia="Calibri" w:cs="Calibri" w:ascii="Calibri" w:hAnsi="Calibri"/>
-          <w:i/>
-          <w:color w:val="00B0F0"/>
-          <w:sz w:val="48"/>
-          <w:szCs w:val="48"/>
           <w:lang w:val="en-US"/>
         </w:rPr>
         <w:t>EX 1 - Type Inference</w:t>
@@ -1009,7 +961,7 @@
           <w:color w:val="1F2328"/>
         </w:rPr>
       </w:pPr>
-      <w:hyperlink r:id="rId21">
+      <w:hyperlink r:id="rId20">
         <w:r>
           <w:rPr>
             <w:rStyle w:val="Hyperlink"/>
@@ -1195,6 +1147,12 @@
         </w:rPr>
         <w:t>String name = “omra”</w:t>
       </w:r>
+      <w:r>
+        <w:rPr>
+          <w:color w:val="00B050"/>
+        </w:rPr>
+        <w:t>;</w:t>
+      </w:r>
     </w:p>
     <w:p>
       <w:pPr>
@@ -1256,7 +1214,7 @@
           <w:color w:val="1F2328"/>
         </w:rPr>
       </w:pPr>
-      <w:hyperlink r:id="rId22">
+      <w:hyperlink r:id="rId21">
         <w:r>
           <w:rPr>
             <w:rStyle w:val="Hyperlink"/>
@@ -1270,7 +1228,7 @@
         <w:rPr/>
         <w:t xml:space="preserve">  </w:t>
       </w:r>
-      <w:hyperlink r:id="rId23">
+      <w:hyperlink r:id="rId22">
         <w:r>
           <w:rPr>
             <w:rStyle w:val="Hyperlink"/>
@@ -1407,14 +1365,7 @@
           <w:rFonts w:eastAsia="Calibri" w:cs="Calibri" w:ascii="Calibri" w:hAnsi="Calibri"/>
           <w:lang w:val="en-US"/>
         </w:rPr>
-        <w:t xml:space="preserve">When </w:t>
-      </w:r>
-      <w:r>
-        <w:rPr>
-          <w:rFonts w:eastAsia="Calibri" w:cs="Calibri" w:ascii="Calibri" w:hAnsi="Calibri"/>
-          <w:lang w:val="en-US"/>
-        </w:rPr>
-        <w:t>a variable might not have value</w:t>
+        <w:t>When a variable might not have value</w:t>
       </w:r>
     </w:p>
     <w:p>
@@ -1694,6 +1645,12 @@
         </w:rPr>
         <w:t>final name = “omra”</w:t>
       </w:r>
+      <w:r>
+        <w:rPr>
+          <w:color w:val="00B050"/>
+        </w:rPr>
+        <w:t>;</w:t>
+      </w:r>
     </w:p>
     <w:p>
       <w:pPr>
@@ -1883,7 +1840,7 @@
           <w:color w:val="1F2328"/>
         </w:rPr>
       </w:pPr>
-      <w:hyperlink r:id="rId24">
+      <w:hyperlink r:id="rId23">
         <w:r>
           <w:rPr>
             <w:rStyle w:val="Hyperlink"/>
@@ -1897,7 +1854,7 @@
         <w:rPr/>
         <w:t xml:space="preserve">  </w:t>
       </w:r>
-      <w:hyperlink r:id="rId25">
+      <w:hyperlink r:id="rId24">
         <w:r>
           <w:rPr>
             <w:rStyle w:val="Hyperlink"/>
@@ -2056,71 +2013,35 @@
         <w:rPr>
           <w:color w:val="00B050"/>
         </w:rPr>
-        <w:t xml:space="preserve">String firstName </w:t>
-      </w:r>
-      <w:r>
-        <w:rPr>
-          <w:color w:val="00B050"/>
-        </w:rPr>
-        <w:t>= “Omra”</w:t>
-      </w:r>
-      <w:r>
-        <w:rPr>
-          <w:color w:val="00B050"/>
-        </w:rPr>
-        <w:t>;</w:t>
-      </w:r>
-    </w:p>
-    <w:p>
-      <w:pPr>
-        <w:pStyle w:val="CODE"/>
-        <w:rPr>
-          <w:color w:val="00B050"/>
-        </w:rPr>
-      </w:pPr>
-      <w:r>
-        <w:rPr>
-          <w:color w:val="00B050"/>
-        </w:rPr>
-        <w:t xml:space="preserve">String lastName </w:t>
-      </w:r>
-      <w:r>
-        <w:rPr>
-          <w:color w:val="00B050"/>
-        </w:rPr>
-        <w:t>= “Nhean”</w:t>
-      </w:r>
-      <w:r>
-        <w:rPr>
-          <w:color w:val="00B050"/>
-        </w:rPr>
-        <w:t>;</w:t>
-      </w:r>
-    </w:p>
-    <w:p>
-      <w:pPr>
-        <w:pStyle w:val="CODE"/>
-        <w:rPr>
-          <w:color w:val="00B050"/>
-        </w:rPr>
-      </w:pPr>
-      <w:r>
-        <w:rPr>
-          <w:color w:val="00B050"/>
-        </w:rPr>
-        <w:t xml:space="preserve">int age </w:t>
-      </w:r>
-      <w:r>
-        <w:rPr>
-          <w:color w:val="00B050"/>
-        </w:rPr>
-        <w:t>= 10</w:t>
-      </w:r>
-      <w:r>
-        <w:rPr>
-          <w:color w:val="00B050"/>
-        </w:rPr>
-        <w:t>;</w:t>
+        <w:t>String firstName = “Omra”;</w:t>
+      </w:r>
+    </w:p>
+    <w:p>
+      <w:pPr>
+        <w:pStyle w:val="CODE"/>
+        <w:rPr>
+          <w:color w:val="00B050"/>
+        </w:rPr>
+      </w:pPr>
+      <w:r>
+        <w:rPr>
+          <w:color w:val="00B050"/>
+        </w:rPr>
+        <w:t>String lastName = “Nhean”;</w:t>
+      </w:r>
+    </w:p>
+    <w:p>
+      <w:pPr>
+        <w:pStyle w:val="CODE"/>
+        <w:rPr>
+          <w:color w:val="00B050"/>
+        </w:rPr>
+      </w:pPr>
+      <w:r>
+        <w:rPr>
+          <w:color w:val="00B050"/>
+        </w:rPr>
+        <w:t>int age = 10;</w:t>
       </w:r>
     </w:p>
     <w:p>
@@ -2167,11 +2088,7 @@
       </w:pPr>
       <w:r>
         <w:rPr/>
-        <w:t>Lists:</w:t>
-      </w:r>
-      <w:r>
-        <w:rPr/>
-        <w:t>a</w:t>
+        <w:t>Lists:a</w:t>
       </w:r>
     </w:p>
     <w:p>
@@ -2199,13 +2116,7 @@
         <w:rPr>
           <w:color w:val="00B050"/>
         </w:rPr>
-        <w:t xml:space="preserve">List&lt;int&gt; number </w:t>
-      </w:r>
-      <w:r>
-        <w:rPr>
-          <w:color w:val="00B050"/>
-        </w:rPr>
-        <w:t>= [ 1; 2; 3];</w:t>
+        <w:t>List&lt;int&gt; number = [ 1; 2; 3];</w:t>
       </w:r>
     </w:p>
     <w:p>
@@ -2834,7 +2745,7 @@
           <w:color w:val="1F2328"/>
         </w:rPr>
       </w:pPr>
-      <w:hyperlink r:id="rId26">
+      <w:hyperlink r:id="rId25">
         <w:r>
           <w:rPr>
             <w:rStyle w:val="Hyperlink"/>
@@ -2848,7 +2759,7 @@
         <w:rPr/>
         <w:t xml:space="preserve">  </w:t>
       </w:r>
-      <w:hyperlink r:id="rId27">
+      <w:hyperlink r:id="rId26">
         <w:r>
           <w:rPr>
             <w:rStyle w:val="Hyperlink"/>
@@ -3209,7 +3120,7 @@
         <w:rPr>
           <w:rStyle w:val="Hyperlink"/>
           <w:rFonts w:cs="Segoe UI" w:ascii="Segoe UI" w:hAnsi="Segoe UI"/>
-          <w:color w:val="0969DA"/>
+          <w:color w:themeColor="hyperlink" w:val="0969DA"/>
         </w:rPr>
         <w:instrText xml:space="preserve"> HYPERLINK "https://dart.dev/guides/language/language-tour" \l "functions"</w:instrText>
       </w:r>
@@ -3217,7 +3128,7 @@
         <w:rPr>
           <w:rStyle w:val="Hyperlink"/>
           <w:rFonts w:cs="Segoe UI" w:ascii="Segoe UI" w:hAnsi="Segoe UI"/>
-          <w:color w:val="0969DA"/>
+          <w:color w:themeColor="hyperlink" w:val="0969DA"/>
         </w:rPr>
         <w:fldChar w:fldCharType="separate"/>
       </w:r>
@@ -3225,7 +3136,7 @@
         <w:rPr>
           <w:rStyle w:val="Hyperlink"/>
           <w:rFonts w:cs="Segoe UI" w:ascii="Segoe UI" w:hAnsi="Segoe UI"/>
-          <w:color w:val="0969DA"/>
+          <w:color w:themeColor="hyperlink" w:val="0969DA"/>
         </w:rPr>
         <w:t>Functions</w:t>
       </w:r>
@@ -3233,7 +3144,7 @@
         <w:rPr>
           <w:rStyle w:val="Hyperlink"/>
           <w:rFonts w:cs="Segoe UI" w:ascii="Segoe UI" w:hAnsi="Segoe UI"/>
-          <w:color w:val="0969DA"/>
+          <w:color w:themeColor="hyperlink" w:val="0969DA"/>
         </w:rPr>
         <w:fldChar w:fldCharType="end"/>
       </w:r>
@@ -3401,14 +3312,7 @@
           <w:rFonts w:eastAsia="Calibri" w:cs="Calibri" w:ascii="Calibri" w:hAnsi="Calibri"/>
           <w:lang w:val="en-US"/>
         </w:rPr>
-        <w:t xml:space="preserve">arrow function is a short way to write a normal function </w:t>
-      </w:r>
-      <w:r>
-        <w:rPr>
-          <w:rFonts w:eastAsia="Calibri" w:cs="Calibri" w:ascii="Calibri" w:hAnsi="Calibri"/>
-          <w:lang w:val="en-US"/>
-        </w:rPr>
-        <w:t xml:space="preserve">; use =&gt; </w:t>
+        <w:t xml:space="preserve">arrow function is a short way to write a normal function ; use =&gt; </w:t>
       </w:r>
     </w:p>
     <w:p>
@@ -3708,13 +3612,7 @@
         <w:rPr>
           <w:color w:val="00B050"/>
         </w:rPr>
-        <w:t>double getArea(</w:t>
-      </w:r>
-      <w:r>
-        <w:rPr>
-          <w:color w:val="00B050"/>
-        </w:rPr>
-        <w:t>{required double width, required double height}){</w:t>
+        <w:t>double getArea({required double width, required double height}){</w:t>
       </w:r>
     </w:p>
     <w:p>
@@ -3971,28 +3869,7 @@
           <w:rFonts w:eastAsia="Calibri" w:cs="Calibri" w:ascii="Calibri" w:hAnsi="Calibri"/>
           <w:lang w:val="en-US"/>
         </w:rPr>
-        <w:t xml:space="preserve">positional </w:t>
-      </w:r>
-      <w:r>
-        <w:rPr>
-          <w:rFonts w:eastAsia="Calibri" w:cs="Calibri" w:ascii="Calibri" w:hAnsi="Calibri"/>
-          <w:lang w:val="en-US"/>
-        </w:rPr>
-        <w:t xml:space="preserve">argument </w:t>
-      </w:r>
-      <w:r>
-        <w:rPr>
-          <w:rFonts w:eastAsia="Calibri" w:cs="Calibri" w:ascii="Calibri" w:hAnsi="Calibri"/>
-          <w:lang w:val="en-US"/>
-        </w:rPr>
-        <w:t xml:space="preserve">cannot be omitted </w:t>
-      </w:r>
-      <w:r>
-        <w:rPr>
-          <w:rFonts w:eastAsia="Calibri" w:cs="Calibri" w:ascii="Calibri" w:hAnsi="Calibri"/>
-          <w:lang w:val="en-US"/>
-        </w:rPr>
-        <w:t xml:space="preserve">example : </w:t>
+        <w:t xml:space="preserve">positional argument cannot be omitted example : </w:t>
       </w:r>
     </w:p>
     <w:p>
@@ -4574,26 +4451,23 @@
         </w:rPr>
       </w:pPr>
       <w:r>
-        <w:rPr>
-          <w:rFonts w:eastAsia="Calibri" w:cs="Calibri" w:ascii="Calibri" w:hAnsi="Calibri"/>
-        </w:rPr>
-        <w:t>int squareNumber(int a) =&gt; a*a;</w:t>
+        <w:rPr/>
       </w:r>
     </w:p>
     <w:sectPr>
-      <w:headerReference w:type="even" r:id="rId28"/>
-      <w:headerReference w:type="default" r:id="rId29"/>
-      <w:headerReference w:type="first" r:id="rId30"/>
-      <w:footerReference w:type="even" r:id="rId31"/>
-      <w:footerReference w:type="default" r:id="rId32"/>
-      <w:footerReference w:type="first" r:id="rId33"/>
+      <w:headerReference w:type="even" r:id="rId27"/>
+      <w:headerReference w:type="default" r:id="rId28"/>
+      <w:headerReference w:type="first" r:id="rId29"/>
+      <w:footerReference w:type="even" r:id="rId30"/>
+      <w:footerReference w:type="default" r:id="rId31"/>
+      <w:footerReference w:type="first" r:id="rId32"/>
       <w:type w:val="nextPage"/>
       <w:pgSz w:w="12240" w:h="15840"/>
       <w:pgMar w:left="1440" w:right="1440" w:gutter="0" w:header="426" w:top="483" w:footer="720" w:bottom="777"/>
       <w:pgNumType w:fmt="decimal"/>
       <w:formProt w:val="false"/>
       <w:textDirection w:val="lrTb"/>
-      <w:docGrid w:type="default" w:linePitch="312" w:charSpace="4294965247"/>
+      <w:docGrid w:type="default" w:linePitch="312" w:charSpace="0"/>
     </w:sectPr>
   </w:body>
 </w:document>
@@ -4632,7 +4506,6 @@
   <w:p>
     <w:pPr>
       <w:pStyle w:val="Normal"/>
-      <w:pBdr/>
       <w:tabs>
         <w:tab w:val="clear" w:pos="720"/>
         <w:tab w:val="center" w:pos="4680" w:leader="none"/>
@@ -4649,7 +4522,7 @@
         <w:color w:val="000000"/>
       </w:rPr>
       <w:drawing>
-        <wp:anchor behindDoc="1" distT="0" distB="0" distL="0" distR="0" simplePos="0" locked="0" layoutInCell="1" allowOverlap="1" relativeHeight="2">
+        <wp:anchor behindDoc="1" distT="0" distB="0" distL="0" distR="0" simplePos="0" locked="0" layoutInCell="1" allowOverlap="1" relativeHeight="6">
           <wp:simplePos x="0" y="0"/>
           <wp:positionH relativeFrom="column">
             <wp:posOffset>2480310</wp:posOffset>
@@ -4660,7 +4533,7 @@
           <wp:extent cx="671830" cy="835025"/>
           <wp:effectExtent l="0" t="0" r="0" b="0"/>
           <wp:wrapNone/>
-          <wp:docPr id="7" name="Picture 1918598917" descr=""/>
+          <wp:docPr id="6" name="Picture 1918598917" descr=""/>
           <wp:cNvGraphicFramePr>
             <a:graphicFrameLocks xmlns:a="http://schemas.openxmlformats.org/drawingml/2006/main" noChangeAspect="1"/>
           </wp:cNvGraphicFramePr>
@@ -4668,7 +4541,7 @@
             <a:graphicData uri="http://schemas.openxmlformats.org/drawingml/2006/picture">
               <pic:pic xmlns:pic="http://schemas.openxmlformats.org/drawingml/2006/picture">
                 <pic:nvPicPr>
-                  <pic:cNvPr id="7" name="Picture 1918598917" descr=""/>
+                  <pic:cNvPr id="6" name="Picture 1918598917" descr=""/>
                   <pic:cNvPicPr>
                     <a:picLocks noChangeAspect="1" noChangeArrowheads="1"/>
                   </pic:cNvPicPr>
@@ -4760,7 +4633,6 @@
   <w:p>
     <w:pPr>
       <w:pStyle w:val="Normal"/>
-      <w:pBdr/>
       <w:tabs>
         <w:tab w:val="clear" w:pos="720"/>
         <w:tab w:val="center" w:pos="4680" w:leader="none"/>
@@ -4787,7 +4659,6 @@
   <w:p>
     <w:pPr>
       <w:pStyle w:val="Normal"/>
-      <w:pBdr/>
       <w:tabs>
         <w:tab w:val="clear" w:pos="720"/>
         <w:tab w:val="center" w:pos="4680" w:leader="none"/>
@@ -4804,7 +4675,7 @@
         <w:color w:val="000000"/>
       </w:rPr>
       <w:drawing>
-        <wp:anchor behindDoc="1" distT="0" distB="0" distL="0" distR="0" simplePos="0" locked="0" layoutInCell="1" allowOverlap="1" relativeHeight="3">
+        <wp:anchor behindDoc="1" distT="0" distB="0" distL="0" distR="0" simplePos="0" locked="0" layoutInCell="1" allowOverlap="1" relativeHeight="7">
           <wp:simplePos x="0" y="0"/>
           <wp:positionH relativeFrom="column">
             <wp:posOffset>2752725</wp:posOffset>
@@ -4815,7 +4686,7 @@
           <wp:extent cx="641985" cy="335280"/>
           <wp:effectExtent l="0" t="0" r="0" b="0"/>
           <wp:wrapNone/>
-          <wp:docPr id="6" name="Picture 3" descr=""/>
+          <wp:docPr id="5" name="Picture 3" descr=""/>
           <wp:cNvGraphicFramePr>
             <a:graphicFrameLocks xmlns:a="http://schemas.openxmlformats.org/drawingml/2006/main" noChangeAspect="1"/>
           </wp:cNvGraphicFramePr>
@@ -4823,7 +4694,7 @@
             <a:graphicData uri="http://schemas.openxmlformats.org/drawingml/2006/picture">
               <pic:pic xmlns:pic="http://schemas.openxmlformats.org/drawingml/2006/picture">
                 <pic:nvPicPr>
-                  <pic:cNvPr id="6" name="Picture 3" descr=""/>
+                  <pic:cNvPr id="5" name="Picture 3" descr=""/>
                   <pic:cNvPicPr>
                     <a:picLocks noChangeAspect="1" noChangeArrowheads="1"/>
                   </pic:cNvPicPr>
@@ -4873,7 +4744,6 @@
   <w:p>
     <w:pPr>
       <w:pStyle w:val="Normal"/>
-      <w:pBdr/>
       <w:tabs>
         <w:tab w:val="clear" w:pos="720"/>
         <w:tab w:val="center" w:pos="4680" w:leader="none"/>
@@ -4900,7 +4770,6 @@
   <w:p>
     <w:pPr>
       <w:pStyle w:val="Normal"/>
-      <w:pBdr/>
       <w:tabs>
         <w:tab w:val="clear" w:pos="720"/>
         <w:tab w:val="center" w:pos="4680" w:leader="none"/>
@@ -5878,6 +5747,7 @@
     <w:qFormat/>
     <w:pPr>
       <w:widowControl/>
+      <w:suppressAutoHyphens w:val="true"/>
       <w:bidi w:val="0"/>
       <w:spacing w:lineRule="auto" w:line="276" w:before="0" w:after="0"/>
       <w:jc w:val="left"/>
@@ -6230,12 +6100,13 @@
     <w:rsid w:val="00fb61e1"/>
     <w:pPr>
       <w:widowControl/>
+      <w:suppressAutoHyphens w:val="true"/>
       <w:bidi w:val="0"/>
       <w:spacing w:lineRule="auto" w:line="240" w:before="0" w:after="0"/>
       <w:jc w:val="left"/>
     </w:pPr>
     <w:rPr>
-      <w:rFonts w:ascii="Calibri" w:hAnsi="Calibri" w:cs="Calibri" w:asciiTheme="majorHAnsi" w:cstheme="majorHAnsi" w:hAnsiTheme="majorHAnsi" w:eastAsia="Arial"/>
+      <w:rFonts w:ascii="Calibri" w:hAnsi="Calibri" w:eastAsia="Arial" w:cs="Calibri" w:asciiTheme="majorHAnsi" w:cstheme="majorHAnsi" w:hAnsiTheme="majorHAnsi"/>
       <w:color w:val="auto"/>
       <w:kern w:val="0"/>
       <w:sz w:val="22"/>

</xml_diff>